<commit_message>
first draft to change the paper to synthesis based approach.
</commit_message>
<xml_diff>
--- a/Response-to-Reviewers_update.docx
+++ b/Response-to-Reviewers_update.docx
@@ -538,35 +538,42 @@
         </w:rPr>
         <w:t>Key performance and memory claims should be accompanied by clear descriptions of baselines, problem scales, precision settings, and whether results reflect end-to-end workflows or isolated kernels.</w:t>
       </w:r>
-    </w:p>
-    <w:p>
-      <w:pPr>
-        <w:pageBreakBefore/>
-        <w:jc w:val="both"/>
-        <w:rPr>
-          <w:rFonts w:ascii="Calibri" w:hAnsi="Calibri"/>
-          <w:sz w:val="22"/>
-          <w:szCs w:val="22"/>
-        </w:rPr>
-      </w:pPr>
-      <w:r>
-        <w:rPr>
-          <w:rFonts w:ascii="Calibri" w:hAnsi="Calibri"/>
-          <w:b/>
-          <w:sz w:val="22"/>
-          <w:szCs w:val="22"/>
-        </w:rPr>
-        <w:lastRenderedPageBreak/>
+      <w:r>
+        <w:rPr>
+          <w:rFonts w:ascii="Calibri" w:hAnsi="Calibri"/>
+          <w:sz w:val="22"/>
+          <w:szCs w:val="22"/>
+        </w:rPr>
+        <w:t xml:space="preserve"> </w:t>
+      </w:r>
+      <w:r>
+        <w:rPr>
+          <w:rFonts w:ascii="Calibri" w:hAnsi="Calibri"/>
+          <w:b/>
+          <w:bCs/>
+          <w:sz w:val="22"/>
+          <w:szCs w:val="22"/>
+        </w:rPr>
         <w:t>A</w:t>
       </w:r>
       <w:r>
         <w:rPr>
           <w:rFonts w:ascii="Calibri" w:hAnsi="Calibri"/>
           <w:b/>
-          <w:sz w:val="22"/>
-          <w:szCs w:val="22"/>
-        </w:rPr>
-        <w:t>uthor response:</w:t>
+          <w:bCs/>
+          <w:sz w:val="22"/>
+          <w:szCs w:val="22"/>
+        </w:rPr>
+        <w:t>ut</w:t>
+      </w:r>
+      <w:r>
+        <w:rPr>
+          <w:rFonts w:ascii="Calibri" w:hAnsi="Calibri"/>
+          <w:b/>
+          <w:sz w:val="22"/>
+          <w:szCs w:val="22"/>
+        </w:rPr>
+        <w:t>hor response:</w:t>
       </w:r>
       <w:r>
         <w:rPr>
@@ -609,7 +616,111 @@
           <w:sz w:val="22"/>
           <w:szCs w:val="22"/>
         </w:rPr>
-        <w:t xml:space="preserve"> We have updated the section evaluation methodolody to give details on specific parameters used during evaluation as per your suggestion.</w:t>
+        <w:t xml:space="preserve"> </w:t>
+      </w:r>
+      <w:r>
+        <w:rPr>
+          <w:rFonts w:ascii="Calibri" w:hAnsi="Calibri"/>
+          <w:sz w:val="22"/>
+          <w:szCs w:val="22"/>
+        </w:rPr>
+        <w:t xml:space="preserve">Thank you for your suggestion. </w:t>
+      </w:r>
+      <w:r>
+        <w:rPr>
+          <w:rFonts w:ascii="Calibri" w:hAnsi="Calibri"/>
+          <w:sz w:val="22"/>
+          <w:szCs w:val="22"/>
+        </w:rPr>
+        <w:t>We have updated the paper to add s</w:t>
+      </w:r>
+      <w:r>
+        <w:rPr>
+          <w:rFonts w:ascii="Calibri" w:hAnsi="Calibri"/>
+          <w:sz w:val="22"/>
+          <w:szCs w:val="22"/>
+        </w:rPr>
+        <w:t>ection 6.6 : Evaluation methodology and Benchmarking standards</w:t>
+      </w:r>
+      <w:r>
+        <w:rPr>
+          <w:rFonts w:ascii="Calibri" w:hAnsi="Calibri"/>
+          <w:sz w:val="22"/>
+          <w:szCs w:val="22"/>
+        </w:rPr>
+        <w:t>.</w:t>
+      </w:r>
+      <w:r>
+        <w:rPr>
+          <w:rFonts w:ascii="Calibri" w:hAnsi="Calibri"/>
+          <w:sz w:val="22"/>
+          <w:szCs w:val="22"/>
+        </w:rPr>
+        <w:t xml:space="preserve"> </w:t>
+      </w:r>
+      <w:r>
+        <w:rPr>
+          <w:rFonts w:ascii="Calibri" w:hAnsi="Calibri"/>
+          <w:sz w:val="22"/>
+          <w:szCs w:val="22"/>
+        </w:rPr>
+        <w:t xml:space="preserve">Before getting into the details, this sections talks about the factors taken into consideration during performance study. As you rightly pointed out, these results depend on the factors such as computational </w:t>
+      </w:r>
+      <w:r>
+        <w:rPr>
+          <w:rFonts w:ascii="Calibri" w:hAnsi="Calibri"/>
+          <w:sz w:val="22"/>
+          <w:szCs w:val="22"/>
+        </w:rPr>
+        <w:t>precision</w:t>
+      </w:r>
+      <w:r>
+        <w:rPr>
+          <w:rFonts w:ascii="Calibri" w:hAnsi="Calibri"/>
+          <w:sz w:val="22"/>
+          <w:szCs w:val="22"/>
+        </w:rPr>
+        <w:t>,</w:t>
+      </w:r>
+      <w:r>
+        <w:rPr>
+          <w:rFonts w:ascii="Calibri" w:hAnsi="Calibri"/>
+          <w:sz w:val="22"/>
+          <w:szCs w:val="22"/>
+        </w:rPr>
+        <w:t xml:space="preserve"> resolution setting, </w:t>
+      </w:r>
+      <w:r>
+        <w:rPr>
+          <w:rFonts w:ascii="Calibri" w:hAnsi="Calibri"/>
+          <w:sz w:val="22"/>
+          <w:szCs w:val="22"/>
+        </w:rPr>
+        <w:t xml:space="preserve">Execution environment - </w:t>
+      </w:r>
+      <w:r>
+        <w:rPr>
+          <w:rFonts w:ascii="Calibri" w:hAnsi="Calibri"/>
+          <w:sz w:val="22"/>
+          <w:szCs w:val="22"/>
+        </w:rPr>
+        <w:t xml:space="preserve">GPU </w:t>
+      </w:r>
+      <w:r>
+        <w:rPr>
+          <w:rFonts w:ascii="Calibri" w:hAnsi="Calibri"/>
+          <w:sz w:val="22"/>
+          <w:szCs w:val="22"/>
+        </w:rPr>
+        <w:t xml:space="preserve">resident vs Hybrid. </w:t>
+      </w:r>
+      <w:r>
+        <w:rPr>
+          <w:rFonts w:ascii="Calibri" w:hAnsi="Calibri"/>
+          <w:sz w:val="22"/>
+          <w:szCs w:val="22"/>
+        </w:rPr>
+        <w:t xml:space="preserve">We have added these details to provide more context for the study. </w:t>
       </w:r>
     </w:p>
     <w:p>
@@ -632,7 +743,7 @@
           <w:sz w:val="22"/>
           <w:szCs w:val="22"/>
         </w:rPr>
-        <w:pict w14:anchorId="492AFB8F">
+        <w:pict w14:anchorId="6BD9BE84">
           <v:shapetype id="_x0000_t75" coordsize="21600,21600" o:spt="75" o:preferrelative="t" path="m@4@5l@4@11@9@11@9@5xe" filled="f" stroked="f">
             <v:stroke joinstyle="miter"/>
             <v:formulas>
@@ -652,7 +763,7 @@
             <v:path o:extrusionok="f" gradientshapeok="t" o:connecttype="rect"/>
             <o:lock v:ext="edit" aspectratio="t"/>
           </v:shapetype>
-          <v:shape id="Horizontal Line 1" o:spid="_x0000_i1038" type="#_x0000_t75" alt="Default Line" style="width:481.65pt;height:1.1pt;visibility:visible;mso-wrap-style:square">
+          <v:shape id="Horizontal Line 1" o:spid="_x0000_i1038" type="#_x0000_t75" alt="Default Line" style="width:481.7pt;height:1.1pt;visibility:visible;mso-wrap-style:square">
             <v:imagedata r:id="rId8" o:title="Default Line"/>
             <o:lock v:ext="edit" rotation="t" cropping="t" verticies="t"/>
           </v:shape>
@@ -758,7 +869,7 @@
           <w:sz w:val="22"/>
           <w:szCs w:val="22"/>
         </w:rPr>
-        <w:t>your valuable suggestion.</w:t>
+        <w:t>your suggestion.</w:t>
       </w:r>
     </w:p>
     <w:p>
@@ -785,7 +896,7 @@
           <w:sz w:val="22"/>
           <w:szCs w:val="22"/>
         </w:rPr>
-        <w:t xml:space="preserve">We have double checked all our references </w:t>
+        <w:t xml:space="preserve">We have reviewed and if needed, replaced all references with traceable citations as necessary. </w:t>
       </w:r>
     </w:p>
     <w:p>
@@ -808,8 +919,8 @@
           <w:sz w:val="22"/>
           <w:szCs w:val="22"/>
         </w:rPr>
-        <w:pict w14:anchorId="3AE7B238">
-          <v:shape id="Horizontal Line 2" o:spid="_x0000_i1037" type="#_x0000_t75" alt="Default Line" style="width:481.65pt;height:1.1pt;visibility:visible;mso-wrap-style:square">
+        <w:pict w14:anchorId="22D5C28F">
+          <v:shape id="Horizontal Line 2" o:spid="_x0000_i1037" type="#_x0000_t75" alt="Default Line" style="width:481.7pt;height:1.1pt;visibility:visible;mso-wrap-style:square">
             <v:imagedata r:id="rId8" o:title="Default Line"/>
             <o:lock v:ext="edit" rotation="t" cropping="t" verticies="t"/>
           </v:shape>
@@ -914,6 +1025,7 @@
         <w:jc w:val="both"/>
         <w:rPr>
           <w:rFonts w:ascii="Calibri" w:hAnsi="Calibri"/>
+          <w:bCs/>
           <w:sz w:val="22"/>
           <w:szCs w:val="22"/>
         </w:rPr>
@@ -926,22 +1038,6 @@
           <w:szCs w:val="22"/>
         </w:rPr>
         <w:t xml:space="preserve">Author action: </w:t>
-      </w:r>
-      <w:r>
-        <w:rPr>
-          <w:rFonts w:ascii="Calibri" w:hAnsi="Calibri"/>
-          <w:sz w:val="22"/>
-          <w:szCs w:val="22"/>
-        </w:rPr>
-        <w:t xml:space="preserve">According to your comment, </w:t>
-      </w:r>
-      <w:r>
-        <w:rPr>
-          <w:rFonts w:ascii="Calibri" w:hAnsi="Calibri"/>
-          <w:sz w:val="22"/>
-          <w:szCs w:val="22"/>
-        </w:rPr>
-        <w:t xml:space="preserve">we have added details about the floating point precisions used during evaluations. </w:t>
       </w:r>
     </w:p>
     <w:p>
@@ -964,8 +1060,8 @@
           <w:sz w:val="22"/>
           <w:szCs w:val="22"/>
         </w:rPr>
-        <w:pict w14:anchorId="368BB618">
-          <v:shape id="Horizontal Line 3" o:spid="_x0000_i1036" type="#_x0000_t75" alt="Default Line" style="width:481.65pt;height:1.1pt;visibility:visible;mso-wrap-style:square">
+        <w:pict w14:anchorId="37E7623D">
+          <v:shape id="Horizontal Line 3" o:spid="_x0000_i1036" type="#_x0000_t75" alt="Default Line" style="width:481.7pt;height:1.1pt;visibility:visible;mso-wrap-style:square">
             <v:imagedata r:id="rId8" o:title="Default Line"/>
             <o:lock v:ext="edit" rotation="t" cropping="t" verticies="t"/>
           </v:shape>
@@ -1079,34 +1175,11 @@
       <w:r>
         <w:rPr>
           <w:rFonts w:ascii="Calibri" w:hAnsi="Calibri"/>
-          <w:sz w:val="22"/>
-          <w:szCs w:val="22"/>
-        </w:rPr>
-        <w:t>we have</w:t>
-      </w:r>
-      <w:r>
-        <w:rPr>
-          <w:rFonts w:ascii="Calibri" w:hAnsi="Calibri"/>
-          <w:sz w:val="22"/>
-          <w:szCs w:val="22"/>
-        </w:rPr>
-        <w:t xml:space="preserve"> taken your advice </w:t>
-      </w:r>
-      <w:r>
-        <w:rPr>
-          <w:rFonts w:ascii="Calibri" w:hAnsi="Calibri"/>
-          <w:sz w:val="22"/>
-          <w:szCs w:val="22"/>
-        </w:rPr>
-        <w:t xml:space="preserve">and </w:t>
-      </w:r>
-      <w:r>
-        <w:rPr>
-          <w:rFonts w:ascii="Calibri" w:hAnsi="Calibri"/>
-          <w:sz w:val="22"/>
-          <w:szCs w:val="22"/>
-        </w:rPr>
-        <w:t xml:space="preserve">updated the section 8, Roadmap and outlook to point out growing dependence on cuda/ Nvidia eco systems and risks of monopoly. </w:t>
+          <w:bCs/>
+          <w:sz w:val="22"/>
+          <w:szCs w:val="22"/>
+        </w:rPr>
+        <w:t xml:space="preserve">Section 8 : Roadmap and outlook is revamped now. It was section 7.6 in the first submission. It has been elevated to a separate section now to accommodate information about current industry set around GPU tool, and risks associated with over reliance on NVIDIA eco system.  </w:t>
       </w:r>
     </w:p>
     <w:p>
@@ -1129,8 +1202,8 @@
           <w:sz w:val="22"/>
           <w:szCs w:val="22"/>
         </w:rPr>
-        <w:pict w14:anchorId="2622D506">
-          <v:shape id="Horizontal Line 4" o:spid="_x0000_i1035" type="#_x0000_t75" alt="Default Line" style="width:481.65pt;height:1.1pt;visibility:visible;mso-wrap-style:square">
+        <w:pict w14:anchorId="5C98D947">
+          <v:shape id="Horizontal Line 4" o:spid="_x0000_i1035" type="#_x0000_t75" alt="Default Line" style="width:481.7pt;height:1.1pt;visibility:visible;mso-wrap-style:square">
             <v:imagedata r:id="rId8" o:title="Default Line"/>
             <o:lock v:ext="edit" rotation="t" cropping="t" verticies="t"/>
           </v:shape>
@@ -1230,6 +1303,7 @@
           <w:sz w:val="22"/>
           <w:szCs w:val="22"/>
         </w:rPr>
+        <w:lastRenderedPageBreak/>
         <w:t xml:space="preserve">Author action: </w:t>
       </w:r>
       <w:r>
@@ -1238,15 +1312,15 @@
           <w:sz w:val="22"/>
           <w:szCs w:val="22"/>
         </w:rPr>
-        <w:t xml:space="preserve">According to your comment, </w:t>
-      </w:r>
-      <w:r>
-        <w:rPr>
-          <w:rFonts w:ascii="Calibri" w:hAnsi="Calibri"/>
-          <w:sz w:val="22"/>
-          <w:szCs w:val="22"/>
-        </w:rPr>
-        <w:t>we have added a figure describing three important aspects of computational lithography that this paper covers.</w:t>
+        <w:t xml:space="preserve">Thank you for your comment. We have added figure 1 at the end of abstract section. This gives an overview </w:t>
+      </w:r>
+      <w:r>
+        <w:rPr>
+          <w:rFonts w:ascii="Calibri" w:hAnsi="Calibri"/>
+          <w:sz w:val="22"/>
+          <w:szCs w:val="22"/>
+        </w:rPr>
+        <w:t xml:space="preserve">of GPU enabled lithography’s eco system and how the paper is divided into 3 main parts; which are taxonomy, pipeline speed up techniques, and algorithm enhancements. </w:t>
       </w:r>
     </w:p>
     <w:p>
@@ -1269,8 +1343,8 @@
           <w:sz w:val="22"/>
           <w:szCs w:val="22"/>
         </w:rPr>
-        <w:pict w14:anchorId="60B67A96">
-          <v:shape id="Horizontal Line 5" o:spid="_x0000_i1034" type="#_x0000_t75" alt="Default Line" style="width:481.65pt;height:1.1pt;visibility:visible;mso-wrap-style:square">
+        <w:pict w14:anchorId="53F54947">
+          <v:shape id="Horizontal Line 5" o:spid="_x0000_i1034" type="#_x0000_t75" alt="Default Line" style="width:481.7pt;height:1.1pt;visibility:visible;mso-wrap-style:square">
             <v:imagedata r:id="rId8" o:title="Default Line"/>
             <o:lock v:ext="edit" rotation="t" cropping="t" verticies="t"/>
           </v:shape>
@@ -1344,7 +1418,6 @@
           <w:sz w:val="22"/>
           <w:szCs w:val="22"/>
         </w:rPr>
-        <w:lastRenderedPageBreak/>
         <w:t>Author response:</w:t>
       </w:r>
       <w:r>
@@ -1380,7 +1453,7 @@
           <w:sz w:val="22"/>
           <w:szCs w:val="22"/>
         </w:rPr>
-        <w:t xml:space="preserve">We have reviewed and ensured such mistakes are not present in the paper. </w:t>
+        <w:t xml:space="preserve">We have reviewed the paper again and ensured consistency in information flow to provide better reading experience. </w:t>
       </w:r>
     </w:p>
     <w:p>
@@ -1404,8 +1477,8 @@
           <w:sz w:val="22"/>
           <w:szCs w:val="22"/>
         </w:rPr>
-        <w:pict w14:anchorId="7737C8C4">
-          <v:shape id="_x0000_i1033" type="#_x0000_t75" alt="Default Line" style="width:481.65pt;height:1.1pt;visibility:visible;mso-wrap-style:square">
+        <w:pict w14:anchorId="6C1973EB">
+          <v:shape id="_x0000_i1033" type="#_x0000_t75" alt="Default Line" style="width:481.7pt;height:1.1pt;visibility:visible;mso-wrap-style:square">
             <v:imagedata r:id="rId8" o:title="Default Line"/>
             <o:lock v:ext="edit" rotation="t" cropping="t" verticies="t"/>
           </v:shape>
@@ -1678,8 +1751,8 @@
           <w:sz w:val="22"/>
           <w:szCs w:val="22"/>
         </w:rPr>
-        <w:pict w14:anchorId="2F966312">
-          <v:shape id="Horizontal Line 14" o:spid="_x0000_i1032" type="#_x0000_t75" alt="Default Line" style="width:481.65pt;height:1.1pt;visibility:visible;mso-wrap-style:square">
+        <w:pict w14:anchorId="0F07B502">
+          <v:shape id="Horizontal Line 14" o:spid="_x0000_i1032" type="#_x0000_t75" alt="Default Line" style="width:481.7pt;height:1.1pt;visibility:visible;mso-wrap-style:square">
             <v:imagedata r:id="rId8" o:title="Default Line"/>
             <o:lock v:ext="edit" rotation="t" cropping="t" verticies="t"/>
           </v:shape>
@@ -1918,8 +1991,8 @@
           <w:sz w:val="22"/>
           <w:szCs w:val="22"/>
         </w:rPr>
-        <w:pict w14:anchorId="07C74326">
-          <v:shape id="Horizontal Line 15" o:spid="_x0000_i1031" type="#_x0000_t75" alt="Default Line" style="width:481.65pt;height:1.1pt;visibility:visible;mso-wrap-style:square">
+        <w:pict w14:anchorId="7DDBB32B">
+          <v:shape id="Horizontal Line 15" o:spid="_x0000_i1031" type="#_x0000_t75" alt="Default Line" style="width:481.7pt;height:1.1pt;visibility:visible;mso-wrap-style:square">
             <v:imagedata r:id="rId8" o:title="Default Line"/>
             <o:lock v:ext="edit" rotation="t" cropping="t" verticies="t"/>
           </v:shape>
@@ -2158,8 +2231,8 @@
           <w:sz w:val="22"/>
           <w:szCs w:val="22"/>
         </w:rPr>
-        <w:pict w14:anchorId="2B770C96">
-          <v:shape id="Horizontal Line 16" o:spid="_x0000_i1030" type="#_x0000_t75" alt="Default Line" style="width:481.65pt;height:1.1pt;visibility:visible;mso-wrap-style:square">
+        <w:pict w14:anchorId="7330D5D9">
+          <v:shape id="Horizontal Line 16" o:spid="_x0000_i1030" type="#_x0000_t75" alt="Default Line" style="width:481.7pt;height:1.1pt;visibility:visible;mso-wrap-style:square">
             <v:imagedata r:id="rId8" o:title="Default Line"/>
             <o:lock v:ext="edit" rotation="t" cropping="t" verticies="t"/>
           </v:shape>
@@ -2198,6 +2271,7 @@
           <w:sz w:val="22"/>
           <w:szCs w:val="22"/>
         </w:rPr>
+        <w:lastRenderedPageBreak/>
         <w:t>Reviewer#2, Concern # 4:</w:t>
       </w:r>
       <w:r>
@@ -2374,8 +2448,8 @@
           <w:sz w:val="22"/>
           <w:szCs w:val="22"/>
         </w:rPr>
-        <w:pict w14:anchorId="2E3EA9EA">
-          <v:shape id="Horizontal Line 17" o:spid="_x0000_i1029" type="#_x0000_t75" alt="Default Line" style="width:481.65pt;height:1.1pt;visibility:visible;mso-wrap-style:square">
+        <w:pict w14:anchorId="4E9F3AC7">
+          <v:shape id="Horizontal Line 17" o:spid="_x0000_i1029" type="#_x0000_t75" alt="Default Line" style="width:481.7pt;height:1.1pt;visibility:visible;mso-wrap-style:square">
             <v:imagedata r:id="rId8" o:title="Default Line"/>
             <o:lock v:ext="edit" rotation="t" cropping="t" verticies="t"/>
           </v:shape>
@@ -2546,8 +2620,8 @@
           <w:sz w:val="22"/>
           <w:szCs w:val="22"/>
         </w:rPr>
-        <w:pict w14:anchorId="7FD21A68">
-          <v:shape id="Horizontal Line 18" o:spid="_x0000_i1028" type="#_x0000_t75" alt="Default Line" style="width:481.65pt;height:1.1pt;visibility:visible;mso-wrap-style:square">
+        <w:pict w14:anchorId="339BE63E">
+          <v:shape id="Horizontal Line 18" o:spid="_x0000_i1028" type="#_x0000_t75" alt="Default Line" style="width:481.7pt;height:1.1pt;visibility:visible;mso-wrap-style:square">
             <v:imagedata r:id="rId8" o:title="Default Line"/>
             <o:lock v:ext="edit" rotation="t" cropping="t" verticies="t"/>
           </v:shape>
@@ -2711,8 +2785,8 @@
           <w:sz w:val="22"/>
           <w:szCs w:val="22"/>
         </w:rPr>
-        <w:pict w14:anchorId="267BE1D1">
-          <v:shape id="Horizontal Line 19" o:spid="_x0000_i1027" type="#_x0000_t75" alt="Default Line" style="width:481.65pt;height:1.1pt;visibility:visible;mso-wrap-style:square">
+        <w:pict w14:anchorId="10B45FAE">
+          <v:shape id="Horizontal Line 19" o:spid="_x0000_i1027" type="#_x0000_t75" alt="Default Line" style="width:481.7pt;height:1.1pt;visibility:visible;mso-wrap-style:square">
             <v:imagedata r:id="rId8" o:title="Default Line"/>
             <o:lock v:ext="edit" rotation="t" cropping="t" verticies="t"/>
           </v:shape>
@@ -2868,8 +2942,8 @@
           <w:sz w:val="22"/>
           <w:szCs w:val="22"/>
         </w:rPr>
-        <w:pict w14:anchorId="590EC561">
-          <v:shape id="Horizontal Line 20" o:spid="_x0000_i1026" type="#_x0000_t75" alt="Default Line" style="width:481.65pt;height:1.1pt;visibility:visible;mso-wrap-style:square">
+        <w:pict w14:anchorId="7E5AD31A">
+          <v:shape id="Horizontal Line 20" o:spid="_x0000_i1026" type="#_x0000_t75" alt="Default Line" style="width:481.7pt;height:1.1pt;visibility:visible;mso-wrap-style:square">
             <v:imagedata r:id="rId8" o:title="Default Line"/>
             <o:lock v:ext="edit" rotation="t" cropping="t" verticies="t"/>
           </v:shape>
@@ -3192,8 +3266,8 @@
           <w:sz w:val="22"/>
           <w:szCs w:val="22"/>
         </w:rPr>
-        <w:pict w14:anchorId="5FA92C8C">
-          <v:shape id="Horizontal Line 13" o:spid="_x0000_i1025" type="#_x0000_t75" alt="Default Line" style="width:481.65pt;height:1.1pt;visibility:visible;mso-wrap-style:square">
+        <w:pict w14:anchorId="5016CDD6">
+          <v:shape id="Horizontal Line 13" o:spid="_x0000_i1025" type="#_x0000_t75" alt="Default Line" style="width:481.7pt;height:1.1pt;visibility:visible;mso-wrap-style:square">
             <v:imagedata r:id="rId8" o:title="Default Line"/>
             <o:lock v:ext="edit" rotation="t" cropping="t" verticies="t"/>
           </v:shape>

</xml_diff>

<commit_message>
Further updates. Added figures 3 and 4
</commit_message>
<xml_diff>
--- a/Response-to-Reviewers_update.docx
+++ b/Response-to-Reviewers_update.docx
@@ -743,7 +743,7 @@
           <w:sz w:val="22"/>
           <w:szCs w:val="22"/>
         </w:rPr>
-        <w:pict w14:anchorId="6BD9BE84">
+        <w:pict w14:anchorId="6812F336">
           <v:shapetype id="_x0000_t75" coordsize="21600,21600" o:spt="75" o:preferrelative="t" path="m@4@5l@4@11@9@11@9@5xe" filled="f" stroked="f">
             <v:stroke joinstyle="miter"/>
             <v:formulas>
@@ -896,7 +896,7 @@
           <w:sz w:val="22"/>
           <w:szCs w:val="22"/>
         </w:rPr>
-        <w:t xml:space="preserve">We have reviewed and if needed, replaced all references with traceable citations as necessary. </w:t>
+        <w:t xml:space="preserve">Thank you again for the valuable input. We have revamped the paper to focus on synthesis. Section 3, Mathematical and algorithmic formulations has been almost rewritten to compare forward and inverse methods of lithography; Journey and evolution of the field of lithography and how these techniques co-exist in the eco-system to keep making advances in this important field. Figure (3) has also been added at the end of the section to help readers visualize the symbiosis of these techniques. </w:t>
       </w:r>
     </w:p>
     <w:p>
@@ -919,7 +919,7 @@
           <w:sz w:val="22"/>
           <w:szCs w:val="22"/>
         </w:rPr>
-        <w:pict w14:anchorId="22D5C28F">
+        <w:pict w14:anchorId="010E177D">
           <v:shape id="Horizontal Line 2" o:spid="_x0000_i1037" type="#_x0000_t75" alt="Default Line" style="width:481.7pt;height:1.1pt;visibility:visible;mso-wrap-style:square">
             <v:imagedata r:id="rId8" o:title="Default Line"/>
             <o:lock v:ext="edit" rotation="t" cropping="t" verticies="t"/>
@@ -1060,7 +1060,7 @@
           <w:sz w:val="22"/>
           <w:szCs w:val="22"/>
         </w:rPr>
-        <w:pict w14:anchorId="37E7623D">
+        <w:pict w14:anchorId="12DEDAFE">
           <v:shape id="Horizontal Line 3" o:spid="_x0000_i1036" type="#_x0000_t75" alt="Default Line" style="width:481.7pt;height:1.1pt;visibility:visible;mso-wrap-style:square">
             <v:imagedata r:id="rId8" o:title="Default Line"/>
             <o:lock v:ext="edit" rotation="t" cropping="t" verticies="t"/>
@@ -1202,7 +1202,7 @@
           <w:sz w:val="22"/>
           <w:szCs w:val="22"/>
         </w:rPr>
-        <w:pict w14:anchorId="5C98D947">
+        <w:pict w14:anchorId="012B10AC">
           <v:shape id="Horizontal Line 4" o:spid="_x0000_i1035" type="#_x0000_t75" alt="Default Line" style="width:481.7pt;height:1.1pt;visibility:visible;mso-wrap-style:square">
             <v:imagedata r:id="rId8" o:title="Default Line"/>
             <o:lock v:ext="edit" rotation="t" cropping="t" verticies="t"/>
@@ -1343,7 +1343,7 @@
           <w:sz w:val="22"/>
           <w:szCs w:val="22"/>
         </w:rPr>
-        <w:pict w14:anchorId="53F54947">
+        <w:pict w14:anchorId="0431D2DF">
           <v:shape id="Horizontal Line 5" o:spid="_x0000_i1034" type="#_x0000_t75" alt="Default Line" style="width:481.7pt;height:1.1pt;visibility:visible;mso-wrap-style:square">
             <v:imagedata r:id="rId8" o:title="Default Line"/>
             <o:lock v:ext="edit" rotation="t" cropping="t" verticies="t"/>
@@ -1477,7 +1477,7 @@
           <w:sz w:val="22"/>
           <w:szCs w:val="22"/>
         </w:rPr>
-        <w:pict w14:anchorId="6C1973EB">
+        <w:pict w14:anchorId="75F53463">
           <v:shape id="_x0000_i1033" type="#_x0000_t75" alt="Default Line" style="width:481.7pt;height:1.1pt;visibility:visible;mso-wrap-style:square">
             <v:imagedata r:id="rId8" o:title="Default Line"/>
             <o:lock v:ext="edit" rotation="t" cropping="t" verticies="t"/>
@@ -1751,7 +1751,7 @@
           <w:sz w:val="22"/>
           <w:szCs w:val="22"/>
         </w:rPr>
-        <w:pict w14:anchorId="0F07B502">
+        <w:pict w14:anchorId="3BFC581F">
           <v:shape id="Horizontal Line 14" o:spid="_x0000_i1032" type="#_x0000_t75" alt="Default Line" style="width:481.7pt;height:1.1pt;visibility:visible;mso-wrap-style:square">
             <v:imagedata r:id="rId8" o:title="Default Line"/>
             <o:lock v:ext="edit" rotation="t" cropping="t" verticies="t"/>
@@ -1991,7 +1991,7 @@
           <w:sz w:val="22"/>
           <w:szCs w:val="22"/>
         </w:rPr>
-        <w:pict w14:anchorId="7DDBB32B">
+        <w:pict w14:anchorId="6303CA53">
           <v:shape id="Horizontal Line 15" o:spid="_x0000_i1031" type="#_x0000_t75" alt="Default Line" style="width:481.7pt;height:1.1pt;visibility:visible;mso-wrap-style:square">
             <v:imagedata r:id="rId8" o:title="Default Line"/>
             <o:lock v:ext="edit" rotation="t" cropping="t" verticies="t"/>
@@ -2231,7 +2231,7 @@
           <w:sz w:val="22"/>
           <w:szCs w:val="22"/>
         </w:rPr>
-        <w:pict w14:anchorId="7330D5D9">
+        <w:pict w14:anchorId="7AF62FBC">
           <v:shape id="Horizontal Line 16" o:spid="_x0000_i1030" type="#_x0000_t75" alt="Default Line" style="width:481.7pt;height:1.1pt;visibility:visible;mso-wrap-style:square">
             <v:imagedata r:id="rId8" o:title="Default Line"/>
             <o:lock v:ext="edit" rotation="t" cropping="t" verticies="t"/>
@@ -2448,7 +2448,7 @@
           <w:sz w:val="22"/>
           <w:szCs w:val="22"/>
         </w:rPr>
-        <w:pict w14:anchorId="4E9F3AC7">
+        <w:pict w14:anchorId="13176A07">
           <v:shape id="Horizontal Line 17" o:spid="_x0000_i1029" type="#_x0000_t75" alt="Default Line" style="width:481.7pt;height:1.1pt;visibility:visible;mso-wrap-style:square">
             <v:imagedata r:id="rId8" o:title="Default Line"/>
             <o:lock v:ext="edit" rotation="t" cropping="t" verticies="t"/>
@@ -2620,7 +2620,7 @@
           <w:sz w:val="22"/>
           <w:szCs w:val="22"/>
         </w:rPr>
-        <w:pict w14:anchorId="339BE63E">
+        <w:pict w14:anchorId="5714D336">
           <v:shape id="Horizontal Line 18" o:spid="_x0000_i1028" type="#_x0000_t75" alt="Default Line" style="width:481.7pt;height:1.1pt;visibility:visible;mso-wrap-style:square">
             <v:imagedata r:id="rId8" o:title="Default Line"/>
             <o:lock v:ext="edit" rotation="t" cropping="t" verticies="t"/>
@@ -2785,7 +2785,7 @@
           <w:sz w:val="22"/>
           <w:szCs w:val="22"/>
         </w:rPr>
-        <w:pict w14:anchorId="10B45FAE">
+        <w:pict w14:anchorId="49FF5C0A">
           <v:shape id="Horizontal Line 19" o:spid="_x0000_i1027" type="#_x0000_t75" alt="Default Line" style="width:481.7pt;height:1.1pt;visibility:visible;mso-wrap-style:square">
             <v:imagedata r:id="rId8" o:title="Default Line"/>
             <o:lock v:ext="edit" rotation="t" cropping="t" verticies="t"/>
@@ -2942,7 +2942,7 @@
           <w:sz w:val="22"/>
           <w:szCs w:val="22"/>
         </w:rPr>
-        <w:pict w14:anchorId="7E5AD31A">
+        <w:pict w14:anchorId="79FC1474">
           <v:shape id="Horizontal Line 20" o:spid="_x0000_i1026" type="#_x0000_t75" alt="Default Line" style="width:481.7pt;height:1.1pt;visibility:visible;mso-wrap-style:square">
             <v:imagedata r:id="rId8" o:title="Default Line"/>
             <o:lock v:ext="edit" rotation="t" cropping="t" verticies="t"/>
@@ -3266,7 +3266,7 @@
           <w:sz w:val="22"/>
           <w:szCs w:val="22"/>
         </w:rPr>
-        <w:pict w14:anchorId="5016CDD6">
+        <w:pict w14:anchorId="77F980BD">
           <v:shape id="Horizontal Line 13" o:spid="_x0000_i1025" type="#_x0000_t75" alt="Default Line" style="width:481.7pt;height:1.1pt;visibility:visible;mso-wrap-style:square">
             <v:imagedata r:id="rId8" o:title="Default Line"/>
             <o:lock v:ext="edit" rotation="t" cropping="t" verticies="t"/>

</xml_diff>